<commit_message>
Restore editable Word research CVs
</commit_message>
<xml_diff>
--- a/Xuehao_Xu_Research_CV_CN_v4.docx
+++ b/Xuehao_Xu_Research_CV_CN_v4.docx
@@ -4,47 +4,744 @@
   <w:body>
     <w:p>
       <w:pPr>
-        <w:spacing w:before="0" w:after="0" w:line="240" w:lineRule="auto"/>
-        <w:jc w:val="center"/>
+        <w:keepNext w:val="0"/>
+        <w:spacing w:before="0" w:after="10" w:line="240" w:lineRule="auto"/>
       </w:pPr>
       <w:r>
-        <w:drawing>
-          <wp:inline xmlns:a="http://schemas.openxmlformats.org/drawingml/2006/main" xmlns:pic="http://schemas.openxmlformats.org/drawingml/2006/picture">
-            <wp:extent cx="7559984" cy="10691987"/>
-            <wp:docPr id="1" name="Picture 1" descr="Rendered research CV page"/>
-            <wp:cNvGraphicFramePr>
-              <a:graphicFrameLocks noChangeAspect="1"/>
-            </wp:cNvGraphicFramePr>
-            <a:graphic>
-              <a:graphicData uri="http://schemas.openxmlformats.org/drawingml/2006/picture">
-                <pic:pic>
-                  <pic:nvPicPr>
-                    <pic:cNvPr id="0" name="cn-1.png"/>
-                    <pic:cNvPicPr/>
-                  </pic:nvPicPr>
-                  <pic:blipFill>
-                    <a:blip r:embed="rId9"/>
-                    <a:stretch>
-                      <a:fillRect/>
-                    </a:stretch>
-                  </pic:blipFill>
-                  <pic:spPr>
-                    <a:xfrm>
-                      <a:off x="0" y="0"/>
-                      <a:ext cx="7559984" cy="10691987"/>
-                    </a:xfrm>
-                    <a:prstGeom prst="rect"/>
-                  </pic:spPr>
-                </pic:pic>
-              </a:graphicData>
-            </a:graphic>
-          </wp:inline>
-        </w:drawing>
+        <w:rPr>
+          <w:rFonts w:ascii="Arial" w:hAnsi="Arial" w:eastAsia="Microsoft YaHei"/>
+          <w:b/>
+          <w:i w:val="0"/>
+          <w:color w:val="12314D"/>
+          <w:sz w:val="42"/>
+        </w:rPr>
+        <w:t>徐学颢</w:t>
+      </w:r>
+      <w:r>
+        <w:rPr>
+          <w:rFonts w:ascii="Arial" w:hAnsi="Arial" w:eastAsia="Microsoft YaHei"/>
+          <w:b w:val="0"/>
+          <w:i w:val="0"/>
+          <w:color w:val="5E6C77"/>
+          <w:sz w:val="20"/>
+        </w:rPr>
+        <w:t xml:space="preserve">  |  科研简历</w:t>
+      </w:r>
+    </w:p>
+    <w:p>
+      <w:pPr>
+        <w:keepNext w:val="0"/>
+        <w:spacing w:before="0" w:after="60" w:line="240" w:lineRule="auto"/>
+        <w:pBdr>
+          <w:bottom w:val="single" w:sz="6" w:space="4" w:color="1E6E96"/>
+        </w:pBdr>
+      </w:pPr>
+      <w:r>
+        <w:rPr>
+          <w:rFonts w:ascii="Arial" w:hAnsi="Arial" w:eastAsia="Microsoft YaHei"/>
+          <w:b w:val="0"/>
+          <w:i w:val="0"/>
+          <w:color w:val="5E6C77"/>
+          <w:sz w:val="17"/>
+        </w:rPr>
+        <w:t>邮箱: xuxue6800@gmail.com | GitHub: github.com/srontover | 个人主页: srontover.github.io</w:t>
+      </w:r>
+    </w:p>
+    <w:p>
+      <w:pPr>
+        <w:keepNext/>
+        <w:spacing w:before="100" w:after="60" w:line="240" w:lineRule="auto"/>
+        <w:pBdr>
+          <w:bottom w:val="single" w:sz="6" w:space="4" w:color="C8D4DE"/>
+        </w:pBdr>
+      </w:pPr>
+      <w:r>
+        <w:rPr>
+          <w:rFonts w:ascii="Arial" w:hAnsi="Arial" w:eastAsia="Microsoft YaHei"/>
+          <w:b/>
+          <w:i w:val="0"/>
+          <w:color w:val="1E6E96"/>
+          <w:sz w:val="18"/>
+        </w:rPr>
+        <w:t>研究兴趣</w:t>
+      </w:r>
+    </w:p>
+    <w:p>
+      <w:pPr>
+        <w:keepNext w:val="0"/>
+        <w:spacing w:before="0" w:after="50" w:line="240" w:lineRule="auto"/>
+      </w:pPr>
+      <w:r>
+        <w:rPr>
+          <w:rFonts w:ascii="Arial" w:hAnsi="Arial" w:eastAsia="Microsoft YaHei"/>
+          <w:b w:val="0"/>
+          <w:i w:val="0"/>
+          <w:color w:val="1D2730"/>
+          <w:sz w:val="18"/>
+        </w:rPr>
+        <w:t>人形机器人学习；强化学习与学习控制；运动先验与模仿学习；统一技能策略；全身控制；接触丰富运动技能；仿真到真实迁移</w:t>
+      </w:r>
+    </w:p>
+    <w:p>
+      <w:pPr>
+        <w:keepNext/>
+        <w:spacing w:before="100" w:after="60" w:line="240" w:lineRule="auto"/>
+        <w:pBdr>
+          <w:bottom w:val="single" w:sz="6" w:space="4" w:color="C8D4DE"/>
+        </w:pBdr>
+      </w:pPr>
+      <w:r>
+        <w:rPr>
+          <w:rFonts w:ascii="Arial" w:hAnsi="Arial" w:eastAsia="Microsoft YaHei"/>
+          <w:b/>
+          <w:i w:val="0"/>
+          <w:color w:val="1E6E96"/>
+          <w:sz w:val="18"/>
+        </w:rPr>
+        <w:t>教育经历</w:t>
+      </w:r>
+    </w:p>
+    <w:p>
+      <w:pPr>
+        <w:keepNext/>
+        <w:spacing w:before="0" w:after="10" w:line="240" w:lineRule="auto"/>
+      </w:pPr>
+      <w:r>
+        <w:rPr>
+          <w:rFonts w:ascii="Arial" w:hAnsi="Arial" w:eastAsia="Microsoft YaHei"/>
+          <w:b/>
+          <w:i w:val="0"/>
+          <w:color w:val="12314D"/>
+          <w:sz w:val="20"/>
+        </w:rPr>
+        <w:t>南京邮电大学（NJUPT）</w:t>
+      </w:r>
+    </w:p>
+    <w:p>
+      <w:pPr>
+        <w:keepNext w:val="0"/>
+        <w:spacing w:before="0" w:after="12" w:line="240" w:lineRule="auto"/>
+      </w:pPr>
+      <w:r>
+        <w:rPr>
+          <w:rFonts w:ascii="Arial" w:hAnsi="Arial" w:eastAsia="Microsoft YaHei"/>
+          <w:b w:val="0"/>
+          <w:i w:val="0"/>
+          <w:color w:val="5E6C77"/>
+          <w:sz w:val="18"/>
+        </w:rPr>
+        <w:t>人工智能专业 工学学士候选人 | 预计毕业：2028 年</w:t>
+      </w:r>
+    </w:p>
+    <w:p>
+      <w:pPr>
+        <w:keepNext w:val="0"/>
+        <w:spacing w:before="0" w:after="40" w:line="240" w:lineRule="auto"/>
+      </w:pPr>
+      <w:r>
+        <w:rPr>
+          <w:rFonts w:ascii="Arial" w:hAnsi="Arial" w:eastAsia="Microsoft YaHei"/>
+          <w:b w:val="0"/>
+          <w:i w:val="0"/>
+          <w:color w:val="1D2730"/>
+          <w:sz w:val="18"/>
+        </w:rPr>
+        <w:t>GPA：4.08/5.0 | 人工智能专业排名：3/133</w:t>
+      </w:r>
+    </w:p>
+    <w:p>
+      <w:pPr>
+        <w:keepNext/>
+        <w:spacing w:before="100" w:after="60" w:line="240" w:lineRule="auto"/>
+        <w:pBdr>
+          <w:bottom w:val="single" w:sz="6" w:space="4" w:color="C8D4DE"/>
+        </w:pBdr>
+      </w:pPr>
+      <w:r>
+        <w:rPr>
+          <w:rFonts w:ascii="Arial" w:hAnsi="Arial" w:eastAsia="Microsoft YaHei"/>
+          <w:b/>
+          <w:i w:val="0"/>
+          <w:color w:val="1E6E96"/>
+          <w:sz w:val="18"/>
+        </w:rPr>
+        <w:t>科研经历</w:t>
+      </w:r>
+    </w:p>
+    <w:p>
+      <w:pPr>
+        <w:keepNext/>
+        <w:tabs>
+          <w:tab w:pos="10656" w:val="right"/>
+        </w:tabs>
+        <w:spacing w:before="40" w:after="8" w:line="240" w:lineRule="auto"/>
+      </w:pPr>
+      <w:r>
+        <w:rPr>
+          <w:rFonts w:ascii="Arial" w:hAnsi="Arial" w:eastAsia="Microsoft YaHei"/>
+          <w:b/>
+          <w:i w:val="0"/>
+          <w:color w:val="12314D"/>
+          <w:sz w:val="20"/>
+        </w:rPr>
+        <w:t>人形机器人学习与运动先验研究</w:t>
+      </w:r>
+      <w:r>
+        <w:rPr>
+          <w:rFonts w:ascii="Arial" w:hAnsi="Arial" w:eastAsia="Microsoft YaHei"/>
+          <w:b w:val="0"/>
+          <w:i/>
+          <w:color w:val="5E6C77"/>
+          <w:sz w:val="18"/>
+        </w:rPr>
+        <w:tab/>
+        <w:t>2026.09-至今</w:t>
+      </w:r>
+    </w:p>
+    <w:p>
+      <w:pPr>
+        <w:keepNext/>
+        <w:spacing w:before="0" w:after="12" w:line="240" w:lineRule="auto"/>
+      </w:pPr>
+      <w:r>
+        <w:rPr>
+          <w:rFonts w:ascii="Arial" w:hAnsi="Arial" w:eastAsia="Microsoft YaHei"/>
+          <w:b w:val="0"/>
+          <w:i/>
+          <w:color w:val="5E6C77"/>
+          <w:sz w:val="17"/>
+        </w:rPr>
+        <w:t>香港中文大学 | 科研实习生（远程） | 指导：颜子轲博士（清华大学 AIR）、李钟毓助理教授（香港中文大学机械与自动化工程学系）</w:t>
+      </w:r>
+    </w:p>
+    <w:p>
+      <w:pPr>
+        <w:pStyle w:val="ListBullet"/>
+        <w:keepNext w:val="0"/>
+        <w:spacing w:before="0" w:after="10" w:line="240" w:lineRule="auto"/>
+        <w:ind w:left="274" w:hanging="202"/>
+      </w:pPr>
+      <w:r>
+        <w:rPr>
+          <w:rFonts w:ascii="Arial" w:hAnsi="Arial" w:eastAsia="Microsoft YaHei"/>
+          <w:b w:val="0"/>
+          <w:i w:val="0"/>
+          <w:color w:val="1D2730"/>
+          <w:sz w:val="17"/>
+        </w:rPr>
+        <w:t>围绕人形机器人学习、全身控制、运动模仿 / 运动先验与任务适应开展科研训练，包括文献调研、论文精读、Slide 汇报、研究问题提炼、方法讨论与实验规划。</w:t>
+      </w:r>
+    </w:p>
+    <w:p>
+      <w:pPr>
+        <w:pStyle w:val="ListBullet"/>
+        <w:keepNext w:val="0"/>
+        <w:spacing w:before="0" w:after="10" w:line="240" w:lineRule="auto"/>
+        <w:ind w:left="274" w:hanging="202"/>
+      </w:pPr>
+      <w:r>
+        <w:rPr>
+          <w:rFonts w:ascii="Arial" w:hAnsi="Arial" w:eastAsia="Microsoft YaHei"/>
+          <w:b w:val="0"/>
+          <w:i w:val="0"/>
+          <w:color w:val="1D2730"/>
+          <w:sz w:val="17"/>
+        </w:rPr>
+        <w:t>系统调研 RoboNaldo、Humanoid Goalkeeper、PAiD、PGMT、SMP、ADD、ConsMimic、CMDP 等工作，重点分析 task objective 与 motion imitation / motion prior 的冲突、条件化放松与多目标优化思路。</w:t>
+      </w:r>
+    </w:p>
+    <w:p>
+      <w:pPr>
+        <w:pStyle w:val="ListBullet"/>
+        <w:keepNext w:val="0"/>
+        <w:spacing w:before="0" w:after="10" w:line="240" w:lineRule="auto"/>
+        <w:ind w:left="274" w:hanging="202"/>
+      </w:pPr>
+      <w:r>
+        <w:rPr>
+          <w:rFonts w:ascii="Arial" w:hAnsi="Arial" w:eastAsia="Microsoft YaHei"/>
+          <w:b w:val="0"/>
+          <w:i w:val="0"/>
+          <w:color w:val="1D2730"/>
+          <w:sz w:val="17"/>
+        </w:rPr>
+        <w:t>当前关注 unified policy、非连续运动数据导致的 skill transition / OOD，以及不严重依赖 joint-level tracking error 的 human-like motion guidance；保持组内周级和 PI 双周级讨论，并计划复现 SMP 及足球相关基线。</w:t>
+      </w:r>
+    </w:p>
+    <w:p>
+      <w:pPr>
+        <w:keepNext/>
+        <w:tabs>
+          <w:tab w:pos="10656" w:val="right"/>
+        </w:tabs>
+        <w:spacing w:before="40" w:after="8" w:line="240" w:lineRule="auto"/>
+      </w:pPr>
+      <w:r>
+        <w:rPr>
+          <w:rFonts w:ascii="Arial" w:hAnsi="Arial" w:eastAsia="Microsoft YaHei"/>
+          <w:b/>
+          <w:i w:val="0"/>
+          <w:color w:val="12314D"/>
+          <w:sz w:val="20"/>
+        </w:rPr>
+        <w:t>Booster T1 人形机器人强化学习与动态技能训练</w:t>
+      </w:r>
+      <w:r>
+        <w:rPr>
+          <w:rFonts w:ascii="Arial" w:hAnsi="Arial" w:eastAsia="Microsoft YaHei"/>
+          <w:b w:val="0"/>
+          <w:i/>
+          <w:color w:val="5E6C77"/>
+          <w:sz w:val="18"/>
+        </w:rPr>
+        <w:tab/>
+        <w:t>2026-至今</w:t>
+      </w:r>
+    </w:p>
+    <w:p>
+      <w:pPr>
+        <w:keepNext/>
+        <w:spacing w:before="0" w:after="12" w:line="240" w:lineRule="auto"/>
+      </w:pPr>
+      <w:r>
+        <w:rPr>
+          <w:rFonts w:ascii="Arial" w:hAnsi="Arial" w:eastAsia="Microsoft YaHei"/>
+          <w:b w:val="0"/>
+          <w:i/>
+          <w:color w:val="5E6C77"/>
+          <w:sz w:val="17"/>
+        </w:rPr>
+        <w:t>独立项目 | 步态、踢球与 Conditional AMP 探索</w:t>
+      </w:r>
+    </w:p>
+    <w:p>
+      <w:pPr>
+        <w:pStyle w:val="ListBullet"/>
+        <w:keepNext w:val="0"/>
+        <w:spacing w:before="0" w:after="10" w:line="240" w:lineRule="auto"/>
+        <w:ind w:left="274" w:hanging="202"/>
+      </w:pPr>
+      <w:r>
+        <w:rPr>
+          <w:rFonts w:ascii="Arial" w:hAnsi="Arial" w:eastAsia="Microsoft YaHei"/>
+          <w:b w:val="0"/>
+          <w:i w:val="0"/>
+          <w:color w:val="1D2730"/>
+          <w:sz w:val="17"/>
+        </w:rPr>
+        <w:t>基于 23 DoF Booster T1，在 MuJoCo、MJLab 与 Warp 仿真工具链中实现并修改人形机器人强化学习训练环境，使用 PPO 训练 locomotion 与 kicking skill。</w:t>
+      </w:r>
+    </w:p>
+    <w:p>
+      <w:pPr>
+        <w:pStyle w:val="ListBullet"/>
+        <w:keepNext w:val="0"/>
+        <w:spacing w:before="0" w:after="10" w:line="240" w:lineRule="auto"/>
+        <w:ind w:left="274" w:hanging="202"/>
+      </w:pPr>
+      <w:r>
+        <w:rPr>
+          <w:rFonts w:ascii="Arial" w:hAnsi="Arial" w:eastAsia="Microsoft YaHei"/>
+          <w:b w:val="0"/>
+          <w:i w:val="0"/>
+          <w:color w:val="1D2730"/>
+          <w:sz w:val="17"/>
+        </w:rPr>
+        <w:t>配置 8192 个并行环境，完成观测与动作空间设计、球体重置、接触检测、奖励塑形、终止条件和课程学习等任务组件的实现与评估。</w:t>
+      </w:r>
+    </w:p>
+    <w:p>
+      <w:pPr>
+        <w:pStyle w:val="ListBullet"/>
+        <w:keepNext w:val="0"/>
+        <w:spacing w:before="0" w:after="10" w:line="240" w:lineRule="auto"/>
+        <w:ind w:left="274" w:hanging="202"/>
+      </w:pPr>
+      <w:r>
+        <w:rPr>
+          <w:rFonts w:ascii="Arial" w:hAnsi="Arial" w:eastAsia="Microsoft YaHei"/>
+          <w:b w:val="0"/>
+          <w:i w:val="0"/>
+          <w:color w:val="1D2730"/>
+          <w:sz w:val="17"/>
+        </w:rPr>
+        <w:t>已建立“接近足球-调整站位-向前踢球-恢复稳定姿态”的训练与评估流程，使用接触质量、球速、目标方向误差、终止原因与训练稳定性分析策略行为；高精度射门误差优化仍在进行。</w:t>
+      </w:r>
+    </w:p>
+    <w:p>
+      <w:pPr>
+        <w:pStyle w:val="ListBullet"/>
+        <w:keepNext w:val="0"/>
+        <w:spacing w:before="0" w:after="10" w:line="240" w:lineRule="auto"/>
+        <w:ind w:left="274" w:hanging="202"/>
+      </w:pPr>
+      <w:r>
+        <w:rPr>
+          <w:rFonts w:ascii="Arial" w:hAnsi="Arial" w:eastAsia="Microsoft YaHei"/>
+          <w:b w:val="0"/>
+          <w:i w:val="0"/>
+          <w:color w:val="1D2730"/>
+          <w:sz w:val="17"/>
+        </w:rPr>
+        <w:t>开展 Conditional AMP / motion-prior 探索，研究 expert motion 与 policy condition 的对齐、动作泛化及训练稳定性。</w:t>
+      </w:r>
+    </w:p>
+    <w:p>
+      <w:pPr>
+        <w:keepNext/>
+        <w:tabs>
+          <w:tab w:pos="10656" w:val="right"/>
+        </w:tabs>
+        <w:spacing w:before="40" w:after="8" w:line="240" w:lineRule="auto"/>
+      </w:pPr>
+      <w:r>
+        <w:rPr>
+          <w:rFonts w:ascii="Arial" w:hAnsi="Arial" w:eastAsia="Microsoft YaHei"/>
+          <w:b/>
+          <w:i w:val="0"/>
+          <w:color w:val="12314D"/>
+          <w:sz w:val="20"/>
+        </w:rPr>
+        <w:t>基于三维感知与几何约束的机器人手眼标定</w:t>
+      </w:r>
+      <w:r>
+        <w:rPr>
+          <w:rFonts w:ascii="Arial" w:hAnsi="Arial" w:eastAsia="Microsoft YaHei"/>
+          <w:b w:val="0"/>
+          <w:i/>
+          <w:color w:val="5E6C77"/>
+          <w:sz w:val="18"/>
+        </w:rPr>
+        <w:tab/>
+        <w:t>2026</w:t>
+      </w:r>
+    </w:p>
+    <w:p>
+      <w:pPr>
+        <w:keepNext/>
+        <w:spacing w:before="0" w:after="12" w:line="240" w:lineRule="auto"/>
+      </w:pPr>
+      <w:r>
+        <w:rPr>
+          <w:rFonts w:ascii="Arial" w:hAnsi="Arial" w:eastAsia="Microsoft YaHei"/>
+          <w:b w:val="0"/>
+          <w:i/>
+          <w:color w:val="5E6C77"/>
+          <w:sz w:val="17"/>
+        </w:rPr>
+        <w:t>南京邮电大学 | 科研项目 | 论文工作推进中</w:t>
+      </w:r>
+    </w:p>
+    <w:p>
+      <w:pPr>
+        <w:pStyle w:val="ListBullet"/>
+        <w:keepNext w:val="0"/>
+        <w:spacing w:before="0" w:after="10" w:line="240" w:lineRule="auto"/>
+        <w:ind w:left="274" w:hanging="202"/>
+      </w:pPr>
+      <w:r>
+        <w:rPr>
+          <w:rFonts w:ascii="Arial" w:hAnsi="Arial" w:eastAsia="Microsoft YaHei"/>
+          <w:b w:val="0"/>
+          <w:i w:val="0"/>
+          <w:color w:val="1D2730"/>
+          <w:sz w:val="17"/>
+        </w:rPr>
+        <w:t>面向工业机器人与三维视觉系统开展手眼标定研究，使用 ABB IRB-120 / IRC5 和 Keyence LJ-X8000A / LJ-X8060 完成机器人运动、IO 触发、轮廓采集与系统联调。</w:t>
+      </w:r>
+    </w:p>
+    <w:p>
+      <w:pPr>
+        <w:pStyle w:val="ListBullet"/>
+        <w:keepNext w:val="0"/>
+        <w:spacing w:before="0" w:after="10" w:line="240" w:lineRule="auto"/>
+        <w:ind w:left="274" w:hanging="202"/>
+      </w:pPr>
+      <w:r>
+        <w:rPr>
+          <w:rFonts w:ascii="Arial" w:hAnsi="Arial" w:eastAsia="Microsoft YaHei"/>
+          <w:b w:val="0"/>
+          <w:i w:val="0"/>
+          <w:color w:val="1D2730"/>
+          <w:sz w:val="17"/>
+        </w:rPr>
+        <w:t>设计并验证包含正交几何约束预标定、动态点云筛选、精细优化和独立测试的多阶段标定流程。</w:t>
+      </w:r>
+    </w:p>
+    <w:p>
+      <w:pPr>
+        <w:pStyle w:val="ListBullet"/>
+        <w:keepNext w:val="0"/>
+        <w:spacing w:before="0" w:after="10" w:line="240" w:lineRule="auto"/>
+        <w:ind w:left="274" w:hanging="202"/>
+      </w:pPr>
+      <w:r>
+        <w:rPr>
+          <w:rFonts w:ascii="Arial" w:hAnsi="Arial" w:eastAsia="Microsoft YaHei"/>
+          <w:b w:val="0"/>
+          <w:i w:val="0"/>
+          <w:color w:val="1D2730"/>
+          <w:sz w:val="17"/>
+        </w:rPr>
+        <w:t>完成多姿态、多边缘、多点数据采集，并参与处理机器人零点、SMB 电池、触发同步等实际系统问题；相关发明专利申请已公开：CN121821412A，论文工作仍在推进中。</w:t>
+      </w:r>
+    </w:p>
+    <w:p>
+      <w:pPr>
+        <w:keepNext/>
+        <w:spacing w:before="100" w:after="60" w:line="240" w:lineRule="auto"/>
+        <w:pBdr>
+          <w:bottom w:val="single" w:sz="6" w:space="4" w:color="C8D4DE"/>
+        </w:pBdr>
+      </w:pPr>
+      <w:r>
+        <w:rPr>
+          <w:rFonts w:ascii="Arial" w:hAnsi="Arial" w:eastAsia="Microsoft YaHei"/>
+          <w:b/>
+          <w:i w:val="0"/>
+          <w:color w:val="1E6E96"/>
+          <w:sz w:val="18"/>
+        </w:rPr>
+        <w:t>竞赛工程经历</w:t>
+      </w:r>
+    </w:p>
+    <w:p>
+      <w:pPr>
+        <w:keepNext/>
+        <w:tabs>
+          <w:tab w:pos="10656" w:val="right"/>
+        </w:tabs>
+        <w:spacing w:before="40" w:after="8" w:line="240" w:lineRule="auto"/>
+      </w:pPr>
+      <w:r>
+        <w:rPr>
+          <w:rFonts w:ascii="Arial" w:hAnsi="Arial" w:eastAsia="Microsoft YaHei"/>
+          <w:b/>
+          <w:i w:val="0"/>
+          <w:color w:val="12314D"/>
+          <w:sz w:val="20"/>
+        </w:rPr>
+        <w:t>简易自行瞄准装置</w:t>
+      </w:r>
+      <w:r>
+        <w:rPr>
+          <w:rFonts w:ascii="Arial" w:hAnsi="Arial" w:eastAsia="Microsoft YaHei"/>
+          <w:b w:val="0"/>
+          <w:i/>
+          <w:color w:val="5E6C77"/>
+          <w:sz w:val="18"/>
+        </w:rPr>
+        <w:tab/>
+        <w:t>2025</w:t>
+      </w:r>
+    </w:p>
+    <w:p>
+      <w:pPr>
+        <w:keepNext/>
+        <w:spacing w:before="0" w:after="12" w:line="240" w:lineRule="auto"/>
+      </w:pPr>
+      <w:r>
+        <w:rPr>
+          <w:rFonts w:ascii="Arial" w:hAnsi="Arial" w:eastAsia="Microsoft YaHei"/>
+          <w:b w:val="0"/>
+          <w:i/>
+          <w:color w:val="5E6C77"/>
+          <w:sz w:val="17"/>
+        </w:rPr>
+        <w:t>全国大学生电子设计竞赛 | 视觉感知与目标跟踪负责人 | 3 人团队 | 江苏省三等奖</w:t>
+      </w:r>
+    </w:p>
+    <w:p>
+      <w:pPr>
+        <w:pStyle w:val="ListBullet"/>
+        <w:keepNext w:val="0"/>
+        <w:spacing w:before="0" w:after="10" w:line="240" w:lineRule="auto"/>
+        <w:ind w:left="274" w:hanging="202"/>
+      </w:pPr>
+      <w:r>
+        <w:rPr>
+          <w:rFonts w:ascii="Arial" w:hAnsi="Arial" w:eastAsia="Microsoft YaHei"/>
+          <w:b w:val="0"/>
+          <w:i w:val="0"/>
+          <w:color w:val="1D2730"/>
+          <w:sz w:val="17"/>
+        </w:rPr>
+        <w:t>基于 Raspberry Pi 与工业摄像头搭建实时视觉处理系统，负责目标检测、靶心定位与持续跟踪模块。</w:t>
+      </w:r>
+    </w:p>
+    <w:p>
+      <w:pPr>
+        <w:pStyle w:val="ListBullet"/>
+        <w:keepNext w:val="0"/>
+        <w:spacing w:before="0" w:after="10" w:line="240" w:lineRule="auto"/>
+        <w:ind w:left="274" w:hanging="202"/>
+      </w:pPr>
+      <w:r>
+        <w:rPr>
+          <w:rFonts w:ascii="Arial" w:hAnsi="Arial" w:eastAsia="Microsoft YaHei"/>
+          <w:b w:val="0"/>
+          <w:i w:val="0"/>
+          <w:color w:val="1D2730"/>
+          <w:sz w:val="17"/>
+        </w:rPr>
+        <w:t>使用 OpenCV 实现颜色阈值分割、轮廓提取与圆形检测，以约 30 Hz 向下游控制模块输出靶心位置信息；调试阈值与目标筛选逻辑以提升移动小车和云台运动下的跟踪稳定性，并与云台及执行机构控制模块联调，支持闭环目标跟踪和自动瞄准。</w:t>
+      </w:r>
+    </w:p>
+    <w:p>
+      <w:pPr>
+        <w:keepNext/>
+        <w:spacing w:before="100" w:after="60" w:line="240" w:lineRule="auto"/>
+        <w:pBdr>
+          <w:bottom w:val="single" w:sz="6" w:space="4" w:color="C8D4DE"/>
+        </w:pBdr>
+      </w:pPr>
+      <w:r>
+        <w:rPr>
+          <w:rFonts w:ascii="Arial" w:hAnsi="Arial" w:eastAsia="Microsoft YaHei"/>
+          <w:b/>
+          <w:i w:val="0"/>
+          <w:color w:val="1E6E96"/>
+          <w:sz w:val="18"/>
+        </w:rPr>
+        <w:t>技术能力</w:t>
+      </w:r>
+    </w:p>
+    <w:p>
+      <w:pPr>
+        <w:keepNext w:val="0"/>
+        <w:spacing w:before="0" w:after="16" w:line="240" w:lineRule="auto"/>
+      </w:pPr>
+      <w:r>
+        <w:rPr>
+          <w:rFonts w:ascii="Arial" w:hAnsi="Arial" w:eastAsia="Microsoft YaHei"/>
+          <w:b/>
+          <w:i w:val="0"/>
+          <w:color w:val="12314D"/>
+          <w:sz w:val="17"/>
+        </w:rPr>
+        <w:t>编程与工程：</w:t>
+      </w:r>
+      <w:r>
+        <w:rPr>
+          <w:rFonts w:ascii="Arial" w:hAnsi="Arial" w:eastAsia="Microsoft YaHei"/>
+          <w:b w:val="0"/>
+          <w:i w:val="0"/>
+          <w:color w:val="1D2730"/>
+          <w:sz w:val="17"/>
+        </w:rPr>
+        <w:t>Python、C++、Git/GitHub、Linux</w:t>
+      </w:r>
+    </w:p>
+    <w:p>
+      <w:pPr>
+        <w:keepNext w:val="0"/>
+        <w:spacing w:before="0" w:after="16" w:line="240" w:lineRule="auto"/>
+      </w:pPr>
+      <w:r>
+        <w:rPr>
+          <w:rFonts w:ascii="Arial" w:hAnsi="Arial" w:eastAsia="Microsoft YaHei"/>
+          <w:b/>
+          <w:i w:val="0"/>
+          <w:color w:val="12314D"/>
+          <w:sz w:val="17"/>
+        </w:rPr>
+        <w:t>机器学习与机器人学习：</w:t>
+      </w:r>
+      <w:r>
+        <w:rPr>
+          <w:rFonts w:ascii="Arial" w:hAnsi="Arial" w:eastAsia="Microsoft YaHei"/>
+          <w:b w:val="0"/>
+          <w:i w:val="0"/>
+          <w:color w:val="1D2730"/>
+          <w:sz w:val="17"/>
+        </w:rPr>
+        <w:t>PyTorch、PPO、奖励设计、课程学习、人形机器人运动控制、运动模仿、运动先验、Conditional AMP</w:t>
+      </w:r>
+    </w:p>
+    <w:p>
+      <w:pPr>
+        <w:keepNext w:val="0"/>
+        <w:spacing w:before="0" w:after="16" w:line="240" w:lineRule="auto"/>
+      </w:pPr>
+      <w:r>
+        <w:rPr>
+          <w:rFonts w:ascii="Arial" w:hAnsi="Arial" w:eastAsia="Microsoft YaHei"/>
+          <w:b/>
+          <w:i w:val="0"/>
+          <w:color w:val="12314D"/>
+          <w:sz w:val="17"/>
+        </w:rPr>
+        <w:t>仿真、机器人与视觉系统：</w:t>
+      </w:r>
+      <w:r>
+        <w:rPr>
+          <w:rFonts w:ascii="Arial" w:hAnsi="Arial" w:eastAsia="Microsoft YaHei"/>
+          <w:b w:val="0"/>
+          <w:i w:val="0"/>
+          <w:color w:val="1D2730"/>
+          <w:sz w:val="17"/>
+        </w:rPr>
+        <w:t>MuJoCo、MJLab、Warp、ABB RAPID、机器人标定、三维感知、点云处理、OpenCV、目标跟踪、相机-控制接口联调</w:t>
+      </w:r>
+    </w:p>
+    <w:p>
+      <w:pPr>
+        <w:keepNext/>
+        <w:spacing w:before="100" w:after="60" w:line="240" w:lineRule="auto"/>
+        <w:pBdr>
+          <w:bottom w:val="single" w:sz="6" w:space="4" w:color="C8D4DE"/>
+        </w:pBdr>
+      </w:pPr>
+      <w:r>
+        <w:rPr>
+          <w:rFonts w:ascii="Arial" w:hAnsi="Arial" w:eastAsia="Microsoft YaHei"/>
+          <w:b/>
+          <w:i w:val="0"/>
+          <w:color w:val="1E6E96"/>
+          <w:sz w:val="18"/>
+        </w:rPr>
+        <w:t>竞赛与荣誉</w:t>
+      </w:r>
+    </w:p>
+    <w:p>
+      <w:pPr>
+        <w:pStyle w:val="ListBullet"/>
+        <w:keepNext w:val="0"/>
+        <w:spacing w:before="0" w:after="10" w:line="240" w:lineRule="auto"/>
+        <w:ind w:left="274" w:hanging="202"/>
+      </w:pPr>
+      <w:r>
+        <w:rPr>
+          <w:rFonts w:ascii="Arial" w:hAnsi="Arial" w:eastAsia="Microsoft YaHei"/>
+          <w:b w:val="0"/>
+          <w:i w:val="0"/>
+          <w:color w:val="1D2730"/>
+          <w:sz w:val="17"/>
+        </w:rPr>
+        <w:t>RoboCup 中国公开赛 3D 仿真组第三名（2025）。</w:t>
+      </w:r>
+    </w:p>
+    <w:p>
+      <w:pPr>
+        <w:pStyle w:val="ListBullet"/>
+        <w:keepNext w:val="0"/>
+        <w:spacing w:before="0" w:after="10" w:line="240" w:lineRule="auto"/>
+        <w:ind w:left="274" w:hanging="202"/>
+      </w:pPr>
+      <w:r>
+        <w:rPr>
+          <w:rFonts w:ascii="Arial" w:hAnsi="Arial" w:eastAsia="Microsoft YaHei"/>
+          <w:b w:val="0"/>
+          <w:i w:val="0"/>
+          <w:color w:val="1D2730"/>
+          <w:sz w:val="17"/>
+        </w:rPr>
+        <w:t>江苏省机器人竞赛 3D 仿真组第三名（2025）。</w:t>
       </w:r>
     </w:p>
     <w:sectPr>
-      <w:pgSz w:w="11905" w:h="16838"/>
-      <w:pgMar w:top="0" w:right="0" w:bottom="0" w:left="0" w:header="0" w:footer="0" w:gutter="0"/>
+      <w:pgSz w:w="11909" w:h="16834"/>
+      <w:pgMar w:top="432" w:right="605" w:bottom="144" w:left="605" w:header="360" w:footer="115" w:gutter="0"/>
       <w:cols w:space="720"/>
       <w:docGrid w:linePitch="360"/>
     </w:sectPr>
@@ -415,6 +1112,11 @@
     <w:name w:val="Normal"/>
     <w:qFormat/>
     <w:rsid w:val="00FC693F"/>
+    <w:rPr>
+      <w:rFonts w:ascii="Arial" w:hAnsi="Arial" w:eastAsia="Microsoft YaHei"/>
+      <w:color w:val="1D2730"/>
+      <w:sz w:val="17"/>
+    </w:rPr>
   </w:style>
   <w:style w:type="paragraph" w:styleId="Header">
     <w:name w:val="header"/>

</xml_diff>